<commit_message>
Update operator details and transparent collaboration logo
</commit_message>
<xml_diff>
--- a/public/SurfX_Whitepaper_KO_v0_2.docx
+++ b/public/SurfX_Whitepaper_KO_v0_2.docx
@@ -50,7 +50,7 @@
     </w:p>
     <w:p>
       <w:r>
-        <w:t>운영 책임자는 대표자이며, 공식 지원 창구는 텔레그램·왓츠앱·이메일로 구성한다. 개별 출시 서비스는 정리 후 공개한다. 토큰 공급·보안·재화·운영 재원은 발행 준비 기준안이며, 대표자 성명과 실제 연락처는 본문의 입력 항목에 기재한다.</w:t>
+        <w:t>운영 책임자는 대표자이며, 공식 지원 창구는 텔레그램·왓츠앱·이메일로 구성한다. 개별 출시 서비스는 정리 후 공개한다. 토큰 공급·보안·재화·운영 재원은 발행 준비 기준안이며, 대표자와 사업자 정보 및 공식 이메일은 본문에 기재하고, 텔레그램·왓츠앱 채널은 개설 후 공개한다.</w:t>
       </w:r>
     </w:p>
     <w:p>
@@ -635,20 +635,8 @@
             <w:shd w:fill="FFFFFF"/>
           </w:tcPr>
           <w:p>
-            <w:pPr>
-              <w:keepNext w:val="0"/>
-              <w:widowControl/>
-              <w:spacing w:after="0" w:before="0" w:line="300" w:lineRule="exact"/>
-              <w:jc w:val="left"/>
-            </w:pPr>
             <w:r>
-              <w:rPr>
-                <w:rFonts w:ascii="Noto Sans CJK KR" w:hAnsi="Noto Sans CJK KR" w:eastAsia="Noto Sans CJK KR"/>
-                <w:b w:val="0"/>
-                <w:color w:val="000000"/>
-                <w:sz w:val="20"/>
-              </w:rPr>
-              <w:t>대표자 책임 운영</w:t>
+              <w:t>기업</w:t>
             </w:r>
           </w:p>
         </w:tc>
@@ -688,20 +676,8 @@
             <w:shd w:fill="F1F5F6"/>
           </w:tcPr>
           <w:p>
-            <w:pPr>
-              <w:keepNext w:val="0"/>
-              <w:widowControl/>
-              <w:spacing w:after="0" w:before="0" w:line="300" w:lineRule="exact"/>
-              <w:jc w:val="left"/>
-            </w:pPr>
             <w:r>
-              <w:rPr>
-                <w:rFonts w:ascii="Noto Sans CJK KR" w:hAnsi="Noto Sans CJK KR" w:eastAsia="Noto Sans CJK KR"/>
-                <w:b w:val="0"/>
-                <w:color w:val="000000"/>
-                <w:sz w:val="20"/>
-              </w:rPr>
-              <w:t>[등록 상호와 사업자 정보 기입]</w:t>
+              <w:t>Neocode · 사업자등록번호 422-29-01059</w:t>
             </w:r>
           </w:p>
         </w:tc>
@@ -741,20 +717,8 @@
             <w:shd w:fill="FFFFFF"/>
           </w:tcPr>
           <w:p>
-            <w:pPr>
-              <w:keepNext w:val="0"/>
-              <w:widowControl/>
-              <w:spacing w:after="0" w:before="0" w:line="300" w:lineRule="exact"/>
-              <w:jc w:val="left"/>
-            </w:pPr>
             <w:r>
-              <w:rPr>
-                <w:rFonts w:ascii="Noto Sans CJK KR" w:hAnsi="Noto Sans CJK KR" w:eastAsia="Noto Sans CJK KR"/>
-                <w:b w:val="0"/>
-                <w:color w:val="000000"/>
-                <w:sz w:val="20"/>
-              </w:rPr>
-              <w:t>[대표자 성명 기입]</w:t>
+              <w:t>박은성</w:t>
             </w:r>
           </w:p>
         </w:tc>
@@ -847,21 +811,7 @@
             <w:shd w:fill="FFFFFF"/>
           </w:tcPr>
           <w:p>
-            <w:pPr>
-              <w:keepNext w:val="0"/>
-              <w:widowControl/>
-              <w:spacing w:after="0" w:before="0" w:line="300" w:lineRule="exact"/>
-              <w:jc w:val="left"/>
-            </w:pPr>
-            <w:r>
-              <w:rPr>
-                <w:rFonts w:ascii="Noto Sans CJK KR" w:hAnsi="Noto Sans CJK KR" w:eastAsia="Noto Sans CJK KR"/>
-                <w:b w:val="0"/>
-                <w:color w:val="000000"/>
-                <w:sz w:val="20"/>
-              </w:rPr>
-              <w:t>[공식 채널 또는 지원 계정 링크 기입]</w:t>
-            </w:r>
+            <w:r/>
           </w:p>
         </w:tc>
       </w:tr>
@@ -900,21 +850,7 @@
             <w:shd w:fill="F1F5F6"/>
           </w:tcPr>
           <w:p>
-            <w:pPr>
-              <w:keepNext w:val="0"/>
-              <w:widowControl/>
-              <w:spacing w:after="0" w:before="0" w:line="300" w:lineRule="exact"/>
-              <w:jc w:val="left"/>
-            </w:pPr>
-            <w:r>
-              <w:rPr>
-                <w:rFonts w:ascii="Noto Sans CJK KR" w:hAnsi="Noto Sans CJK KR" w:eastAsia="Noto Sans CJK KR"/>
-                <w:b w:val="0"/>
-                <w:color w:val="000000"/>
-                <w:sz w:val="20"/>
-              </w:rPr>
-              <w:t>[공식 지원 번호 또는 연결 링크 기입]</w:t>
-            </w:r>
+            <w:r/>
           </w:p>
         </w:tc>
       </w:tr>
@@ -953,20 +889,8 @@
             <w:shd w:fill="FFFFFF"/>
           </w:tcPr>
           <w:p>
-            <w:pPr>
-              <w:keepNext w:val="0"/>
-              <w:widowControl/>
-              <w:spacing w:after="0" w:before="0" w:line="300" w:lineRule="exact"/>
-              <w:jc w:val="left"/>
-            </w:pPr>
             <w:r>
-              <w:rPr>
-                <w:rFonts w:ascii="Noto Sans CJK KR" w:hAnsi="Noto Sans CJK KR" w:eastAsia="Noto Sans CJK KR"/>
-                <w:b w:val="0"/>
-                <w:color w:val="000000"/>
-                <w:sz w:val="20"/>
-              </w:rPr>
-              <w:t>[공식 문의 이메일 주소 기입]</w:t>
+              <w:t>neocode.kr@gmail.com</w:t>
             </w:r>
           </w:p>
         </w:tc>
@@ -989,7 +913,7 @@
     </w:p>
     <w:p>
       <w:r>
-        <w:t>실제 계정과 주소는 개설·확인 후 백서 개정본과 공식 안내에 동일하게 기재한다. 공란은 입력 항목이며 현재 활성화된 연락처를 뜻하지 않는다. 대표자나 공식 지원자는 이용자의 개인키 또는 지갑 복구 문구를 요구하지 않는다. 민감한 개인정보는 공개 커뮤니티에 제출하도록 요청하지 않는다.</w:t>
+        <w:t>텔레그램·왓츠앱 계정과 주소는 개설·확인 후 백서 개정본과 공식 안내에 동일하게 기재한다. 공란은 현재 활성화된 연락처를 뜻하지 않는다. 공식 문의 이메일은 neocode.kr@gmail.com이다. 대표자나 공식 지원자는 이용자의 개인키 또는 지갑 복구 문구를 요구하지 않는다. 민감한 개인정보는 공개 커뮤니티에 제출하도록 요청하지 않는다.</w:t>
       </w:r>
     </w:p>
     <w:p>
@@ -8632,20 +8556,8 @@
             <w:shd w:fill="FFFFFF"/>
           </w:tcPr>
           <w:p>
-            <w:pPr>
-              <w:keepNext w:val="0"/>
-              <w:widowControl/>
-              <w:spacing w:after="0" w:before="0" w:line="300" w:lineRule="exact"/>
-              <w:jc w:val="left"/>
-            </w:pPr>
             <w:r>
-              <w:rPr>
-                <w:rFonts w:ascii="Noto Sans CJK KR" w:hAnsi="Noto Sans CJK KR" w:eastAsia="Noto Sans CJK KR"/>
-                <w:b w:val="0"/>
-                <w:color w:val="000000"/>
-                <w:sz w:val="20"/>
-              </w:rPr>
-              <w:t>대표자 성명, 사업자 정보와 실제 Telegram·WhatsApp·이메일 주소 기입</w:t>
+              <w:t>운영 형태 기업, 상호 Neocode, 대표 박은성, 사업자등록번호 422-29-01059, 공식 이메일 neocode.kr@gmail.com. Telegram·WhatsApp은 개설 후 공개</w:t>
             </w:r>
           </w:p>
         </w:tc>

</xml_diff>